<commit_message>
Add Box Sign tags to commitment letter template
- Add [[s:email:signer]] and [[d:email:signer]] tags for embedded signing
- Create backup of original template
- Add Python script to automate tag insertion
- Document template update in TEMPLATE-UPDATED.md

Tags enable is_document_preparation_needed=false for embedded signing.
Box Sign converts tags to interactive fields when creating sign request.
</commit_message>
<xml_diff>
--- a/output/docgen/los-commitment-letter-template.docx
+++ b/output/docgen/los-commitment-letter-template.docx
@@ -825,6 +825,47 @@
         <w:t>This letter is a draft pending Credit Committee approval. It is not a commitment to lend, and it does not authorise signature or funding. {{terms.owner}} owns the decision on this exception.</w:t>
       </w:r>
     </w:p>
+    <w:p/>
+    <w:p>
+      <w:r>
+        <w:t>__________________________________________________</w:t>
+      </w:r>
+      <w:r>
+        <w:br/>
+        <w:t xml:space="preserve">Borrower Signature </w:t>
+      </w:r>
+      <w:r>
+        <w:rPr>
+          <w:color w:val="0066CC"/>
+          <w:sz w:val="20"/>
+        </w:rPr>
+        <w:t>[[s:email:signer]]</w:t>
+      </w:r>
+    </w:p>
+    <w:p/>
+    <w:p>
+      <w:r>
+        <w:t xml:space="preserve">Date: </w:t>
+      </w:r>
+      <w:r>
+        <w:rPr>
+          <w:color w:val="0066CC"/>
+          <w:sz w:val="20"/>
+        </w:rPr>
+        <w:t>[[d:email:signer]]</w:t>
+      </w:r>
+    </w:p>
+    <w:p/>
+    <w:p/>
+    <w:p>
+      <w:r>
+        <w:t>__________________________________________________</w:t>
+      </w:r>
+      <w:r>
+        <w:br/>
+        <w:t>{{loan.borrowerEntity}}</w:t>
+      </w:r>
+    </w:p>
     <w:sectPr>
       <w:headerReference w:type="default" r:id="rId9"/>
       <w:footerReference w:type="default" r:id="rId10"/>

</xml_diff>

<commit_message>
Rebrand Harborview Logistics to Dockwright Logistics for Dreamforce safety.
Replace the Harborview borrower brand across sample data, generators, docs,
tests, UI copy, and regenerated PDF/DOCX fixtures with Dockwright Logistics /
Dockwright Logistics Holdings LLC. Keep Acme Bank, loan IDs, and Harbor Way
geography. Add the dreamforce-p0 rebrand plan with audit inventory and live
Salesforce/Box follow-ups called out separately.

Co-authored-by: Kyle @ Unofficial Box <unofficialbox@users.noreply.github.com>
</commit_message>
<xml_diff>
--- a/output/docgen/los-commitment-letter-template.docx
+++ b/output/docgen/los-commitment-letter-template.docx
@@ -825,47 +825,6 @@
         <w:t>This letter is a draft pending Credit Committee approval. It is not a commitment to lend, and it does not authorise signature or funding. {{terms.owner}} owns the decision on this exception.</w:t>
       </w:r>
     </w:p>
-    <w:p/>
-    <w:p>
-      <w:r>
-        <w:t>__________________________________________________</w:t>
-      </w:r>
-      <w:r>
-        <w:br/>
-        <w:t xml:space="preserve">Borrower Signature </w:t>
-      </w:r>
-      <w:r>
-        <w:rPr>
-          <w:color w:val="0066CC"/>
-          <w:sz w:val="20"/>
-        </w:rPr>
-        <w:t>[[s:email:signer]]</w:t>
-      </w:r>
-    </w:p>
-    <w:p/>
-    <w:p>
-      <w:r>
-        <w:t xml:space="preserve">Date: </w:t>
-      </w:r>
-      <w:r>
-        <w:rPr>
-          <w:color w:val="0066CC"/>
-          <w:sz w:val="20"/>
-        </w:rPr>
-        <w:t>[[d:email:signer]]</w:t>
-      </w:r>
-    </w:p>
-    <w:p/>
-    <w:p/>
-    <w:p>
-      <w:r>
-        <w:t>__________________________________________________</w:t>
-      </w:r>
-      <w:r>
-        <w:br/>
-        <w:t>{{loan.borrowerEntity}}</w:t>
-      </w:r>
-    </w:p>
     <w:sectPr>
       <w:headerReference w:type="default" r:id="rId9"/>
       <w:footerReference w:type="default" r:id="rId10"/>

</xml_diff>

<commit_message>
Fix Doc Gen contract and require verified output before signing
</commit_message>
<xml_diff>
--- a/output/docgen/los-commitment-letter-template.docx
+++ b/output/docgen/los-commitment-letter-template.docx
@@ -825,45 +825,38 @@
         <w:t>This letter is a draft pending Credit Committee approval. It is not a commitment to lend, and it does not authorise signature or funding. {{terms.owner}} owns the decision on this exception.</w:t>
       </w:r>
     </w:p>
-    <w:p/>
     <w:p>
+      <w:pPr>
+        <w:keepNext/>
+      </w:pPr>
       <w:r>
-        <w:t>__________________________________________________</w:t>
-      </w:r>
-      <w:r>
+        <w:t>Borrower signature</w:t>
         <w:br/>
-        <w:t xml:space="preserve">Borrower Signature </w:t>
       </w:r>
       <w:r>
         <w:rPr>
+          <w:rFonts w:ascii="Calibri" w:hAnsi="Calibri"/>
+          <w:b w:val="0"/>
+          <w:i w:val="0"/>
+          <w:color w:val="FFFFFF"/>
+          <w:sz w:val="36"/>
+        </w:rPr>
+        <w:t>[[s|1|id:borrower_signature                    ]]</w:t>
+      </w:r>
+    </w:p>
+    <w:p>
+      <w:r>
+        <w:t xml:space="preserve">Date signed: </w:t>
+      </w:r>
+      <w:r>
+        <w:rPr>
+          <w:rFonts w:ascii="Calibri" w:hAnsi="Calibri"/>
+          <w:b w:val="0"/>
+          <w:i w:val="0"/>
           <w:color w:val="FFFFFF"/>
           <w:sz w:val="20"/>
         </w:rPr>
-        <w:t>[[s:email:signer]]</w:t>
-      </w:r>
-    </w:p>
-    <w:p/>
-    <w:p>
-      <w:r>
-        <w:t xml:space="preserve">Date: </w:t>
-      </w:r>
-      <w:r>
-        <w:rPr>
-          <w:color w:val="FFFFFF"/>
-          <w:sz w:val="20"/>
-        </w:rPr>
-        <w:t>[[d:email:signer]]</w:t>
-      </w:r>
-    </w:p>
-    <w:p/>
-    <w:p/>
-    <w:p>
-      <w:r>
-        <w:t>__________________________________________________</w:t>
-      </w:r>
-      <w:r>
-        <w:br/>
-        <w:t>{{loan.borrowerEntity}}</w:t>
+        <w:t>[[d|1|id:borrower_signed_date]]</w:t>
       </w:r>
     </w:p>
     <w:sectPr>

</xml_diff>

<commit_message>
Fix Doc Gen contract and require verified output before signing (#27)
</commit_message>
<xml_diff>
--- a/output/docgen/los-commitment-letter-template.docx
+++ b/output/docgen/los-commitment-letter-template.docx
@@ -825,45 +825,38 @@
         <w:t>This letter is a draft pending Credit Committee approval. It is not a commitment to lend, and it does not authorise signature or funding. {{terms.owner}} owns the decision on this exception.</w:t>
       </w:r>
     </w:p>
-    <w:p/>
     <w:p>
+      <w:pPr>
+        <w:keepNext/>
+      </w:pPr>
       <w:r>
-        <w:t>__________________________________________________</w:t>
-      </w:r>
-      <w:r>
+        <w:t>Borrower signature</w:t>
         <w:br/>
-        <w:t xml:space="preserve">Borrower Signature </w:t>
       </w:r>
       <w:r>
         <w:rPr>
+          <w:rFonts w:ascii="Calibri" w:hAnsi="Calibri"/>
+          <w:b w:val="0"/>
+          <w:i w:val="0"/>
+          <w:color w:val="FFFFFF"/>
+          <w:sz w:val="36"/>
+        </w:rPr>
+        <w:t>[[s|1|id:borrower_signature                    ]]</w:t>
+      </w:r>
+    </w:p>
+    <w:p>
+      <w:r>
+        <w:t xml:space="preserve">Date signed: </w:t>
+      </w:r>
+      <w:r>
+        <w:rPr>
+          <w:rFonts w:ascii="Calibri" w:hAnsi="Calibri"/>
+          <w:b w:val="0"/>
+          <w:i w:val="0"/>
           <w:color w:val="FFFFFF"/>
           <w:sz w:val="20"/>
         </w:rPr>
-        <w:t>[[s:email:signer]]</w:t>
-      </w:r>
-    </w:p>
-    <w:p/>
-    <w:p>
-      <w:r>
-        <w:t xml:space="preserve">Date: </w:t>
-      </w:r>
-      <w:r>
-        <w:rPr>
-          <w:color w:val="FFFFFF"/>
-          <w:sz w:val="20"/>
-        </w:rPr>
-        <w:t>[[d:email:signer]]</w:t>
-      </w:r>
-    </w:p>
-    <w:p/>
-    <w:p/>
-    <w:p>
-      <w:r>
-        <w:t>__________________________________________________</w:t>
-      </w:r>
-      <w:r>
-        <w:br/>
-        <w:t>{{loan.borrowerEntity}}</w:t>
+        <w:t>[[d|1|id:borrower_signed_date]]</w:t>
       </w:r>
     </w:p>
     <w:sectPr>

</xml_diff>